<commit_message>
Fix Td 1 et 2 Maximilien BERNARD
</commit_message>
<xml_diff>
--- a/Report Maximilien BERNARD.docx
+++ b/Report Maximilien BERNARD.docx
@@ -78,6 +78,9 @@
     </w:p>
     <w:p>
       <w:r>
+        <w:rPr>
+          <w:noProof/>
+        </w:rPr>
         <w:drawing>
           <wp:inline distT="0" distB="0" distL="0" distR="0" wp14:anchorId="5CDB3796" wp14:editId="698DB801">
             <wp:extent cx="5760720" cy="1213485"/>
@@ -117,6 +120,9 @@
     </w:p>
     <w:p>
       <w:r>
+        <w:rPr>
+          <w:noProof/>
+        </w:rPr>
         <w:drawing>
           <wp:inline distT="0" distB="0" distL="0" distR="0" wp14:anchorId="760BBA8A" wp14:editId="514AE443">
             <wp:extent cx="3346657" cy="646981"/>
@@ -176,6 +182,9 @@
     </w:p>
     <w:p>
       <w:r>
+        <w:rPr>
+          <w:noProof/>
+        </w:rPr>
         <w:drawing>
           <wp:inline distT="0" distB="0" distL="0" distR="0" wp14:anchorId="29546CDA" wp14:editId="26E09D86">
             <wp:extent cx="3953427" cy="866896"/>
@@ -220,6 +229,9 @@
     </w:p>
     <w:p>
       <w:r>
+        <w:rPr>
+          <w:noProof/>
+        </w:rPr>
         <w:lastRenderedPageBreak/>
         <w:drawing>
           <wp:inline distT="0" distB="0" distL="0" distR="0" wp14:anchorId="3D9C425E" wp14:editId="2EAADB01">
@@ -265,6 +277,9 @@
     </w:p>
     <w:p>
       <w:r>
+        <w:rPr>
+          <w:noProof/>
+        </w:rPr>
         <w:drawing>
           <wp:inline distT="0" distB="0" distL="0" distR="0" wp14:anchorId="58A28C01" wp14:editId="6EE1EE7B">
             <wp:extent cx="4782217" cy="2924583"/>
@@ -304,6 +319,9 @@
     </w:p>
     <w:p>
       <w:r>
+        <w:rPr>
+          <w:noProof/>
+        </w:rPr>
         <w:lastRenderedPageBreak/>
         <w:drawing>
           <wp:inline distT="0" distB="0" distL="0" distR="0" wp14:anchorId="226CA932" wp14:editId="399C8FDF">
@@ -344,6 +362,9 @@
     </w:p>
     <w:p>
       <w:r>
+        <w:rPr>
+          <w:noProof/>
+        </w:rPr>
         <w:drawing>
           <wp:inline distT="0" distB="0" distL="0" distR="0" wp14:anchorId="7F6DDC91" wp14:editId="34B3B304">
             <wp:extent cx="5077534" cy="1190791"/>
@@ -403,6 +424,9 @@
     </w:p>
     <w:p>
       <w:r>
+        <w:rPr>
+          <w:noProof/>
+        </w:rPr>
         <w:drawing>
           <wp:inline distT="0" distB="0" distL="0" distR="0" wp14:anchorId="0A880966" wp14:editId="66B88BB4">
             <wp:extent cx="5760720" cy="2277110"/>
@@ -447,6 +471,9 @@
     </w:p>
     <w:p>
       <w:r>
+        <w:rPr>
+          <w:noProof/>
+        </w:rPr>
         <w:lastRenderedPageBreak/>
         <w:drawing>
           <wp:inline distT="0" distB="0" distL="0" distR="0" wp14:anchorId="0B86C7AC" wp14:editId="4CA6DAD7">
@@ -487,6 +514,9 @@
     </w:p>
     <w:p>
       <w:r>
+        <w:rPr>
+          <w:noProof/>
+        </w:rPr>
         <w:lastRenderedPageBreak/>
         <w:drawing>
           <wp:inline distT="0" distB="0" distL="0" distR="0" wp14:anchorId="6BA9ED9F" wp14:editId="710DD5F5">
@@ -547,6 +577,9 @@
     </w:p>
     <w:p>
       <w:r>
+        <w:rPr>
+          <w:noProof/>
+        </w:rPr>
         <w:drawing>
           <wp:inline distT="0" distB="0" distL="0" distR="0" wp14:anchorId="15CC1BD3" wp14:editId="52543CED">
             <wp:extent cx="5677692" cy="638264"/>
@@ -591,6 +624,9 @@
     </w:p>
     <w:p>
       <w:r>
+        <w:rPr>
+          <w:noProof/>
+        </w:rPr>
         <w:lastRenderedPageBreak/>
         <w:drawing>
           <wp:inline distT="0" distB="0" distL="0" distR="0" wp14:anchorId="27CDE5A0" wp14:editId="20EEEE30">
@@ -644,20 +680,14 @@
           <w:b/>
           <w:bCs/>
         </w:rPr>
-        <w:t xml:space="preserve">Run </w:t>
-      </w:r>
-      <w:proofErr w:type="spellStart"/>
-      <w:r>
-        <w:rPr>
-          <w:b/>
-          <w:bCs/>
-        </w:rPr>
-        <w:t>MarketPulse</w:t>
-      </w:r>
-      <w:proofErr w:type="spellEnd"/>
-    </w:p>
-    <w:p>
-      <w:r>
+        <w:t>Run MarketPulse</w:t>
+      </w:r>
+    </w:p>
+    <w:p>
+      <w:r>
+        <w:rPr>
+          <w:noProof/>
+        </w:rPr>
         <w:drawing>
           <wp:inline distT="0" distB="0" distL="0" distR="0" wp14:anchorId="014F5E66" wp14:editId="3A5C039D">
             <wp:extent cx="5760720" cy="3090545"/>
@@ -702,25 +732,19 @@
           <w:bCs/>
         </w:rPr>
       </w:pPr>
-      <w:proofErr w:type="spellStart"/>
-      <w:r>
-        <w:rPr>
-          <w:b/>
-          <w:bCs/>
-        </w:rPr>
-        <w:t>Optional</w:t>
-      </w:r>
-      <w:proofErr w:type="spellEnd"/>
-      <w:r>
-        <w:rPr>
-          <w:b/>
-          <w:bCs/>
-        </w:rPr>
-        <w:t xml:space="preserve"> 1</w:t>
-      </w:r>
-    </w:p>
-    <w:p>
-      <w:r>
+      <w:r>
+        <w:rPr>
+          <w:b/>
+          <w:bCs/>
+        </w:rPr>
+        <w:t>Optional 1</w:t>
+      </w:r>
+    </w:p>
+    <w:p>
+      <w:r>
+        <w:rPr>
+          <w:noProof/>
+        </w:rPr>
         <w:drawing>
           <wp:inline distT="0" distB="0" distL="0" distR="0" wp14:anchorId="4E625201" wp14:editId="2CF0DC86">
             <wp:extent cx="5582429" cy="857370"/>
@@ -766,21 +790,12 @@
           <w:bCs/>
         </w:rPr>
       </w:pPr>
-      <w:proofErr w:type="spellStart"/>
-      <w:r>
-        <w:rPr>
-          <w:b/>
-          <w:bCs/>
-        </w:rPr>
-        <w:t>Optional</w:t>
-      </w:r>
-      <w:proofErr w:type="spellEnd"/>
-      <w:r>
-        <w:rPr>
-          <w:b/>
-          <w:bCs/>
-        </w:rPr>
-        <w:t xml:space="preserve"> 2</w:t>
+      <w:r>
+        <w:rPr>
+          <w:b/>
+          <w:bCs/>
+        </w:rPr>
+        <w:t>Optional 2</w:t>
       </w:r>
     </w:p>
     <w:p>
@@ -834,15 +849,7 @@
     </w:p>
     <w:p>
       <w:r>
-        <w:t xml:space="preserve">Head affiche les 5 premières lignes du csv alors que </w:t>
-      </w:r>
-      <w:proofErr w:type="spellStart"/>
-      <w:r>
-        <w:t>tail</w:t>
-      </w:r>
-      <w:proofErr w:type="spellEnd"/>
-      <w:r>
-        <w:t xml:space="preserve"> affiche les 5 dernières lignes du csv</w:t>
+        <w:t>Head affiche les 5 premières lignes du csv alors que tail affiche les 5 dernières lignes du csv</w:t>
       </w:r>
     </w:p>
     <w:p/>
@@ -853,34 +860,26 @@
           <w:bCs/>
         </w:rPr>
       </w:pPr>
-      <w:proofErr w:type="spellStart"/>
-      <w:r>
-        <w:rPr>
-          <w:b/>
-          <w:bCs/>
-        </w:rPr>
-        <w:t>Optional</w:t>
-      </w:r>
-      <w:proofErr w:type="spellEnd"/>
-      <w:r>
-        <w:rPr>
-          <w:b/>
-          <w:bCs/>
-        </w:rPr>
-        <w:t xml:space="preserve"> 3</w:t>
-      </w:r>
-    </w:p>
-    <w:p>
-      <w:pPr>
-        <w:rPr>
-          <w:b/>
-          <w:bCs/>
-        </w:rPr>
-      </w:pPr>
-      <w:r>
-        <w:rPr>
-          <w:b/>
-          <w:bCs/>
+      <w:r>
+        <w:rPr>
+          <w:b/>
+          <w:bCs/>
+        </w:rPr>
+        <w:t>Optional 3</w:t>
+      </w:r>
+    </w:p>
+    <w:p>
+      <w:pPr>
+        <w:rPr>
+          <w:b/>
+          <w:bCs/>
+        </w:rPr>
+      </w:pPr>
+      <w:r>
+        <w:rPr>
+          <w:b/>
+          <w:bCs/>
+          <w:noProof/>
         </w:rPr>
         <w:lastRenderedPageBreak/>
         <w:drawing>
@@ -935,34 +934,26 @@
           <w:bCs/>
         </w:rPr>
       </w:pPr>
-      <w:proofErr w:type="spellStart"/>
-      <w:r>
-        <w:rPr>
-          <w:b/>
-          <w:bCs/>
-        </w:rPr>
-        <w:t>Optional</w:t>
-      </w:r>
-      <w:proofErr w:type="spellEnd"/>
-      <w:r>
-        <w:rPr>
-          <w:b/>
-          <w:bCs/>
-        </w:rPr>
-        <w:t xml:space="preserve"> 4</w:t>
-      </w:r>
-    </w:p>
-    <w:p>
-      <w:pPr>
-        <w:rPr>
-          <w:b/>
-          <w:bCs/>
-        </w:rPr>
-      </w:pPr>
-      <w:r>
-        <w:rPr>
-          <w:b/>
-          <w:bCs/>
+      <w:r>
+        <w:rPr>
+          <w:b/>
+          <w:bCs/>
+        </w:rPr>
+        <w:t>Optional 4</w:t>
+      </w:r>
+    </w:p>
+    <w:p>
+      <w:pPr>
+        <w:rPr>
+          <w:b/>
+          <w:bCs/>
+        </w:rPr>
+      </w:pPr>
+      <w:r>
+        <w:rPr>
+          <w:b/>
+          <w:bCs/>
+          <w:noProof/>
         </w:rPr>
         <w:drawing>
           <wp:inline distT="0" distB="0" distL="0" distR="0" wp14:anchorId="0D90C449" wp14:editId="197F94E0">
@@ -1021,12 +1012,14 @@
         <w:rPr>
           <w:b/>
           <w:bCs/>
-        </w:rPr>
-      </w:pPr>
-      <w:r>
-        <w:rPr>
-          <w:b/>
-          <w:bCs/>
+          <w:lang w:val="en-US"/>
+        </w:rPr>
+      </w:pPr>
+      <w:r>
+        <w:rPr>
+          <w:b/>
+          <w:bCs/>
+          <w:lang w:val="en-US"/>
         </w:rPr>
         <w:t>Part 2</w:t>
       </w:r>
@@ -1040,25 +1033,14 @@
         <w:rPr>
           <w:lang w:val="en-US"/>
         </w:rPr>
-        <w:t xml:space="preserve">Inspect </w:t>
-      </w:r>
-      <w:r>
-        <w:rPr>
-          <w:lang w:val="en-US"/>
-        </w:rPr>
-        <w:t>cat data/sample/</w:t>
-      </w:r>
-      <w:proofErr w:type="spellStart"/>
-      <w:r>
-        <w:rPr>
-          <w:lang w:val="en-US"/>
-        </w:rPr>
-        <w:t>instruments.json</w:t>
-      </w:r>
-      <w:proofErr w:type="spellEnd"/>
-    </w:p>
-    <w:p>
-      <w:r>
+        <w:t>Inspect cat data/sample/instruments.json</w:t>
+      </w:r>
+    </w:p>
+    <w:p>
+      <w:r>
+        <w:rPr>
+          <w:noProof/>
+        </w:rPr>
         <w:lastRenderedPageBreak/>
         <w:drawing>
           <wp:inline distT="0" distB="0" distL="0" distR="0" wp14:anchorId="2F844EF7" wp14:editId="253345B5">
@@ -1099,75 +1081,45 @@
     </w:p>
     <w:p/>
     <w:p>
-      <w:proofErr w:type="spellStart"/>
-      <w:r>
-        <w:t>Temporarily</w:t>
-      </w:r>
-      <w:proofErr w:type="spellEnd"/>
-      <w:r>
-        <w:t xml:space="preserve"> </w:t>
-      </w:r>
-      <w:proofErr w:type="spellStart"/>
-      <w:r>
-        <w:t>inspect</w:t>
-      </w:r>
-      <w:proofErr w:type="spellEnd"/>
-      <w:r>
-        <w:t xml:space="preserve"> the </w:t>
-      </w:r>
-      <w:proofErr w:type="spellStart"/>
-      <w:proofErr w:type="gramStart"/>
-      <w:r>
-        <w:t>result</w:t>
-      </w:r>
-      <w:proofErr w:type="spellEnd"/>
-      <w:r>
-        <w:t>:</w:t>
-      </w:r>
-      <w:proofErr w:type="gramEnd"/>
+      <w:pPr>
+        <w:rPr>
+          <w:lang w:val="en-US"/>
+        </w:rPr>
+      </w:pPr>
+      <w:r>
+        <w:rPr>
+          <w:lang w:val="en-US"/>
+        </w:rPr>
+        <w:t>Temporarily inspect the result:</w:t>
+      </w:r>
     </w:p>
     <w:p>
       <w:pPr>
         <w:pStyle w:val="ListParagraph"/>
-      </w:pPr>
-      <w:proofErr w:type="spellStart"/>
-      <w:proofErr w:type="gramStart"/>
-      <w:r>
-        <w:t>print</w:t>
-      </w:r>
-      <w:proofErr w:type="spellEnd"/>
-      <w:proofErr w:type="gramEnd"/>
-      <w:r>
-        <w:t>(type(instruments))</w:t>
+        <w:rPr>
+          <w:lang w:val="en-US"/>
+        </w:rPr>
+      </w:pPr>
+      <w:r>
+        <w:rPr>
+          <w:lang w:val="en-US"/>
+        </w:rPr>
+        <w:t>print(type(instruments))</w:t>
       </w:r>
     </w:p>
     <w:p>
       <w:pPr>
         <w:pStyle w:val="ListParagraph"/>
       </w:pPr>
-      <w:proofErr w:type="spellStart"/>
-      <w:proofErr w:type="gramStart"/>
-      <w:r>
-        <w:t>print</w:t>
-      </w:r>
-      <w:proofErr w:type="spellEnd"/>
-      <w:proofErr w:type="gramEnd"/>
-      <w:r>
-        <w:t>(</w:t>
-      </w:r>
-      <w:proofErr w:type="spellStart"/>
-      <w:proofErr w:type="gramStart"/>
-      <w:r>
-        <w:t>instruments.keys</w:t>
-      </w:r>
-      <w:proofErr w:type="spellEnd"/>
-      <w:proofErr w:type="gramEnd"/>
-      <w:r>
-        <w:t>())</w:t>
-      </w:r>
-    </w:p>
-    <w:p>
-      <w:r>
+      <w:r>
+        <w:t>print(instruments.keys())</w:t>
+      </w:r>
+    </w:p>
+    <w:p>
+      <w:r>
+        <w:rPr>
+          <w:noProof/>
+        </w:rPr>
         <w:drawing>
           <wp:inline distT="0" distB="0" distL="0" distR="0" wp14:anchorId="536FA874" wp14:editId="7D9E5236">
             <wp:extent cx="3886742" cy="362001"/>
@@ -1229,21 +1181,7 @@
         <w:rPr>
           <w:lang w:val="en-US"/>
         </w:rPr>
-        <w:t xml:space="preserve">instrument = </w:t>
-      </w:r>
-      <w:proofErr w:type="gramStart"/>
-      <w:r>
-        <w:rPr>
-          <w:lang w:val="en-US"/>
-        </w:rPr>
-        <w:t>instruments["</w:t>
-      </w:r>
-      <w:proofErr w:type="gramEnd"/>
-      <w:r>
-        <w:rPr>
-          <w:lang w:val="en-US"/>
-        </w:rPr>
-        <w:t>instrument"]</w:t>
+        <w:t>instrument = instruments["instrument"]</w:t>
       </w:r>
     </w:p>
     <w:p>
@@ -1293,21 +1231,7 @@
         <w:rPr>
           <w:lang w:val="en-US"/>
         </w:rPr>
-        <w:t>print(</w:t>
-      </w:r>
-      <w:proofErr w:type="gramStart"/>
-      <w:r>
-        <w:rPr>
-          <w:lang w:val="en-US"/>
-        </w:rPr>
-        <w:t>instrument["</w:t>
-      </w:r>
-      <w:proofErr w:type="gramEnd"/>
-      <w:r>
-        <w:rPr>
-          <w:lang w:val="en-US"/>
-        </w:rPr>
-        <w:t>name"])</w:t>
+        <w:t>print(instrument["name"])</w:t>
       </w:r>
     </w:p>
     <w:p>
@@ -1350,27 +1274,15 @@
       <w:pPr>
         <w:pStyle w:val="ListParagraph"/>
       </w:pPr>
-      <w:proofErr w:type="spellStart"/>
-      <w:proofErr w:type="gramStart"/>
-      <w:r>
-        <w:t>print</w:t>
-      </w:r>
-      <w:proofErr w:type="spellEnd"/>
-      <w:proofErr w:type="gramEnd"/>
-      <w:r>
-        <w:t>(benchmark["</w:t>
-      </w:r>
-      <w:proofErr w:type="spellStart"/>
-      <w:r>
-        <w:t>name</w:t>
-      </w:r>
-      <w:proofErr w:type="spellEnd"/>
-      <w:r>
-        <w:t>"])</w:t>
-      </w:r>
-    </w:p>
-    <w:p>
-      <w:r>
+      <w:r>
+        <w:t>print(benchmark["name"])</w:t>
+      </w:r>
+    </w:p>
+    <w:p>
+      <w:r>
+        <w:rPr>
+          <w:noProof/>
+        </w:rPr>
         <w:drawing>
           <wp:inline distT="0" distB="0" distL="0" distR="0" wp14:anchorId="3837A7AF" wp14:editId="4A28C502">
             <wp:extent cx="1676634" cy="905001"/>
@@ -1413,12 +1325,14 @@
         <w:rPr>
           <w:b/>
           <w:bCs/>
-        </w:rPr>
-      </w:pPr>
-      <w:r>
-        <w:rPr>
-          <w:b/>
-          <w:bCs/>
+          <w:lang w:val="en-US"/>
+        </w:rPr>
+      </w:pPr>
+      <w:r>
+        <w:rPr>
+          <w:b/>
+          <w:bCs/>
+          <w:lang w:val="en-US"/>
         </w:rPr>
         <w:t>Part 3</w:t>
       </w:r>
@@ -1447,35 +1361,7 @@
         <w:rPr>
           <w:lang w:val="en-US"/>
         </w:rPr>
-        <w:t xml:space="preserve">prices = </w:t>
-      </w:r>
-      <w:proofErr w:type="spellStart"/>
-      <w:r>
-        <w:rPr>
-          <w:lang w:val="en-US"/>
-        </w:rPr>
-        <w:t>load_</w:t>
-      </w:r>
-      <w:proofErr w:type="gramStart"/>
-      <w:r>
-        <w:rPr>
-          <w:lang w:val="en-US"/>
-        </w:rPr>
-        <w:t>prices</w:t>
-      </w:r>
-      <w:proofErr w:type="spellEnd"/>
-      <w:r>
-        <w:rPr>
-          <w:lang w:val="en-US"/>
-        </w:rPr>
-        <w:t>(</w:t>
-      </w:r>
-      <w:proofErr w:type="gramEnd"/>
-      <w:r>
-        <w:rPr>
-          <w:lang w:val="en-US"/>
-        </w:rPr>
-        <w:t>)</w:t>
+        <w:t>prices = load_prices()</w:t>
       </w:r>
     </w:p>
     <w:p>
@@ -1490,83 +1376,31 @@
       <w:pPr>
         <w:pStyle w:val="ListParagraph"/>
       </w:pPr>
-      <w:proofErr w:type="spellStart"/>
-      <w:proofErr w:type="gramStart"/>
-      <w:r>
-        <w:t>print</w:t>
-      </w:r>
-      <w:proofErr w:type="spellEnd"/>
-      <w:proofErr w:type="gramEnd"/>
-      <w:r>
-        <w:t>(type(</w:t>
-      </w:r>
-      <w:proofErr w:type="spellStart"/>
-      <w:r>
-        <w:t>prices</w:t>
-      </w:r>
-      <w:proofErr w:type="spellEnd"/>
-      <w:r>
-        <w:t>))</w:t>
+      <w:r>
+        <w:t>print(type(prices))</w:t>
       </w:r>
     </w:p>
     <w:p>
       <w:pPr>
         <w:pStyle w:val="ListParagraph"/>
       </w:pPr>
-      <w:proofErr w:type="spellStart"/>
-      <w:proofErr w:type="gramStart"/>
-      <w:r>
-        <w:t>print</w:t>
-      </w:r>
-      <w:proofErr w:type="spellEnd"/>
-      <w:proofErr w:type="gramEnd"/>
-      <w:r>
-        <w:t>(type(</w:t>
-      </w:r>
-      <w:proofErr w:type="spellStart"/>
-      <w:proofErr w:type="gramStart"/>
-      <w:r>
-        <w:t>prices</w:t>
-      </w:r>
-      <w:proofErr w:type="spellEnd"/>
-      <w:r>
-        <w:t>[</w:t>
-      </w:r>
-      <w:proofErr w:type="gramEnd"/>
-      <w:r>
-        <w:t>0]))</w:t>
+      <w:r>
+        <w:t>print(type(prices[0]))</w:t>
       </w:r>
     </w:p>
     <w:p>
       <w:pPr>
         <w:pStyle w:val="ListParagraph"/>
       </w:pPr>
-      <w:proofErr w:type="spellStart"/>
-      <w:proofErr w:type="gramStart"/>
-      <w:r>
-        <w:t>print</w:t>
-      </w:r>
-      <w:proofErr w:type="spellEnd"/>
-      <w:proofErr w:type="gramEnd"/>
-      <w:r>
-        <w:t>(</w:t>
-      </w:r>
-      <w:proofErr w:type="spellStart"/>
-      <w:proofErr w:type="gramStart"/>
-      <w:r>
-        <w:t>prices</w:t>
-      </w:r>
-      <w:proofErr w:type="spellEnd"/>
-      <w:r>
-        <w:t>[</w:t>
-      </w:r>
-      <w:proofErr w:type="gramEnd"/>
-      <w:r>
-        <w:t>0])</w:t>
-      </w:r>
-    </w:p>
-    <w:p>
-      <w:r>
+      <w:r>
+        <w:t>print(prices[0])</w:t>
+      </w:r>
+    </w:p>
+    <w:p>
+      <w:r>
+        <w:rPr>
+          <w:noProof/>
+        </w:rPr>
         <w:drawing>
           <wp:inline distT="0" distB="0" distL="0" distR="0" wp14:anchorId="77456281" wp14:editId="64FDD324">
             <wp:extent cx="5760720" cy="339725"/>
@@ -1605,82 +1439,32 @@
       </w:r>
     </w:p>
     <w:p>
-      <w:proofErr w:type="spellStart"/>
-      <w:proofErr w:type="gramStart"/>
-      <w:r>
-        <w:t>Inspect</w:t>
-      </w:r>
-      <w:proofErr w:type="spellEnd"/>
-      <w:r>
-        <w:t>:</w:t>
-      </w:r>
-      <w:proofErr w:type="gramEnd"/>
+      <w:r>
+        <w:t>Inspect:</w:t>
+      </w:r>
     </w:p>
     <w:p>
       <w:pPr>
         <w:pStyle w:val="ListParagraph"/>
       </w:pPr>
-      <w:proofErr w:type="spellStart"/>
-      <w:proofErr w:type="gramStart"/>
-      <w:r>
-        <w:t>print</w:t>
-      </w:r>
-      <w:proofErr w:type="spellEnd"/>
-      <w:proofErr w:type="gramEnd"/>
-      <w:r>
-        <w:t>(</w:t>
-      </w:r>
-      <w:proofErr w:type="spellStart"/>
-      <w:r>
-        <w:t>prices</w:t>
-      </w:r>
-      <w:proofErr w:type="spellEnd"/>
-      <w:r>
-        <w:t>[</w:t>
-      </w:r>
-      <w:proofErr w:type="gramStart"/>
-      <w:r>
-        <w:t>0][</w:t>
-      </w:r>
-      <w:proofErr w:type="gramEnd"/>
-      <w:r>
-        <w:t>"close"])</w:t>
+      <w:r>
+        <w:t>print(prices[0]["close"])</w:t>
       </w:r>
     </w:p>
     <w:p>
       <w:pPr>
         <w:pStyle w:val="ListParagraph"/>
       </w:pPr>
-      <w:proofErr w:type="spellStart"/>
-      <w:proofErr w:type="gramStart"/>
-      <w:r>
-        <w:t>print</w:t>
-      </w:r>
-      <w:proofErr w:type="spellEnd"/>
-      <w:proofErr w:type="gramEnd"/>
-      <w:r>
-        <w:t>(type(</w:t>
-      </w:r>
-      <w:proofErr w:type="spellStart"/>
-      <w:r>
-        <w:t>prices</w:t>
-      </w:r>
-      <w:proofErr w:type="spellEnd"/>
-      <w:r>
-        <w:t>[</w:t>
-      </w:r>
-      <w:proofErr w:type="gramStart"/>
-      <w:r>
-        <w:t>0][</w:t>
-      </w:r>
-      <w:proofErr w:type="gramEnd"/>
-      <w:r>
-        <w:t>"close"]))</w:t>
+      <w:r>
+        <w:t>print(type(prices[0]["close"]))</w:t>
       </w:r>
     </w:p>
     <w:p/>
     <w:p>
       <w:r>
+        <w:rPr>
+          <w:noProof/>
+        </w:rPr>
         <w:drawing>
           <wp:inline distT="0" distB="0" distL="0" distR="0" wp14:anchorId="26EF7020" wp14:editId="4AAD4474">
             <wp:extent cx="1190791" cy="333422"/>
@@ -1733,6 +1517,9 @@
     </w:p>
     <w:p>
       <w:r>
+        <w:rPr>
+          <w:noProof/>
+        </w:rPr>
         <w:drawing>
           <wp:inline distT="0" distB="0" distL="0" distR="0" wp14:anchorId="331B3E87" wp14:editId="373A9CAE">
             <wp:extent cx="5477639" cy="1371791"/>
@@ -1787,6 +1574,9 @@
     </w:p>
     <w:p>
       <w:r>
+        <w:rPr>
+          <w:noProof/>
+        </w:rPr>
         <w:drawing>
           <wp:inline distT="0" distB="0" distL="0" distR="0" wp14:anchorId="3C243FBA" wp14:editId="55AD8B66">
             <wp:extent cx="5020376" cy="457264"/>
@@ -1841,6 +1631,9 @@
     </w:p>
     <w:p>
       <w:r>
+        <w:rPr>
+          <w:noProof/>
+        </w:rPr>
         <w:drawing>
           <wp:inline distT="0" distB="0" distL="0" distR="0" wp14:anchorId="7D70B0C2" wp14:editId="673A0513">
             <wp:extent cx="3096057" cy="1247949"/>
@@ -1880,6 +1673,9 @@
     </w:p>
     <w:p>
       <w:r>
+        <w:rPr>
+          <w:noProof/>
+        </w:rPr>
         <w:drawing>
           <wp:inline distT="0" distB="0" distL="0" distR="0" wp14:anchorId="0CC6C3D0" wp14:editId="4052AD46">
             <wp:extent cx="1971950" cy="333422"/>
@@ -1943,6 +1739,7 @@
         <w:rPr>
           <w:b/>
           <w:bCs/>
+          <w:noProof/>
         </w:rPr>
         <w:lastRenderedPageBreak/>
         <w:drawing>
@@ -1993,6 +1790,7 @@
         <w:rPr>
           <w:b/>
           <w:bCs/>
+          <w:noProof/>
         </w:rPr>
         <w:drawing>
           <wp:inline distT="0" distB="0" distL="0" distR="0" wp14:anchorId="2CA02238" wp14:editId="164D9AA9">
@@ -2057,6 +1855,7 @@
         <w:rPr>
           <w:b/>
           <w:bCs/>
+          <w:noProof/>
         </w:rPr>
         <w:drawing>
           <wp:inline distT="0" distB="0" distL="0" distR="0" wp14:anchorId="5DEC2198" wp14:editId="69ABE3D0">
@@ -2096,7 +1895,25 @@
       </w:r>
     </w:p>
     <w:p/>
-    <w:p/>
+    <w:p>
+      <w:pPr>
+        <w:rPr>
+          <w:lang w:val="en-US"/>
+        </w:rPr>
+      </w:pPr>
+      <w:r>
+        <w:rPr>
+          <w:lang w:val="en-US"/>
+        </w:rPr>
+        <w:t>FOR Part 9-10, full code pushed i</w:t>
+      </w:r>
+      <w:r>
+        <w:rPr>
+          <w:lang w:val="en-US"/>
+        </w:rPr>
+        <w:t>n GitHub Branch</w:t>
+      </w:r>
+    </w:p>
     <w:sectPr>
       <w:pgSz w:w="11906" w:h="16838"/>
       <w:pgMar w:top="1417" w:right="1417" w:bottom="1417" w:left="1417" w:header="708" w:footer="708" w:gutter="0"/>
@@ -2709,6 +2526,7 @@
   <w:style w:type="character" w:default="1" w:styleId="DefaultParagraphFont">
     <w:name w:val="Default Paragraph Font"/>
     <w:uiPriority w:val="1"/>
+    <w:semiHidden/>
     <w:unhideWhenUsed/>
   </w:style>
   <w:style w:type="table" w:default="1" w:styleId="TableNormal">

</xml_diff>